<commit_message>
demo-kit: add standalone VRM path to the demo script
New optional section 6b "The other way in — standalone realization"
demonstrates starting a VR track with no VE study (software already in
place): click New realization track, land on a blank standalone track,
set baselines in Phase 2. Adds a matching objection-handling row and a
timing-sheet entry. Regenerate .docx and .pdf. Stays vendor-neutral.

Co-Authored-By: Claude Opus 4.8 <noreply@anthropic.com>
</commit_message>
<xml_diff>
--- a/demo-kit/ValueLifecycle-Demo-Script.docx
+++ b/demo-kit/ValueLifecycle-Demo-Script.docx
@@ -2272,6 +2272,276 @@
         <w:rPr>
           <w:color w:val="2563EB"/>
         </w:rPr>
+        <w:t xml:space="preserve">6b · The other way in — standalone realization </w:t>
+      </w:r>
+      <w:r>
+        <w:rPr>
+          <w:i/>
+          <w:iCs/>
+          <w:color w:val="2563EB"/>
+        </w:rPr>
+        <w:t xml:space="preserve">(1–2 min · optional)</w:t>
+      </w:r>
+    </w:p>
+    <w:p>
+      <w:pPr>
+        <w:spacing w:after="120" w:line="264"/>
+      </w:pPr>
+      <w:r>
+        <w:t xml:space="preserve">Not every realization starts with a study. When the customer </w:t>
+      </w:r>
+      <w:r>
+        <w:rPr>
+          <w:b/>
+          <w:bCs/>
+        </w:rPr>
+        <w:t xml:space="preserve">already runs the software</w:t>
+      </w:r>
+      <w:r>
+        <w:t xml:space="preserve"> — an existing deployment you simply need to protect and prove value from — you start a realization track </w:t>
+      </w:r>
+      <w:r>
+        <w:rPr>
+          <w:b/>
+          <w:bCs/>
+        </w:rPr>
+        <w:t xml:space="preserve">directly</w:t>
+      </w:r>
+      <w:r>
+        <w:t xml:space="preserve">, with no VE study behind it.</w:t>
+      </w:r>
+    </w:p>
+    <w:p>
+      <w:pPr>
+        <w:spacing w:after="60"/>
+        <w:ind w:left="480" w:hanging="360"/>
+      </w:pPr>
+      <w:r>
+        <w:rPr>
+          <w:b/>
+          <w:bCs/>
+          <w:color w:val="2563EB"/>
+        </w:rPr>
+        <w:t xml:space="preserve">1.	</w:t>
+      </w:r>
+      <w:r>
+        <w:t xml:space="preserve">Go to the </w:t>
+      </w:r>
+      <w:r>
+        <w:rPr>
+          <w:b/>
+          <w:bCs/>
+        </w:rPr>
+        <w:t xml:space="preserve">Value Realization</w:t>
+      </w:r>
+      <w:r>
+        <w:t xml:space="preserve"> workspace and click </w:t>
+      </w:r>
+      <w:r>
+        <w:rPr>
+          <w:b/>
+          <w:bCs/>
+        </w:rPr>
+        <w:t xml:space="preserve">+ New realization track</w:t>
+      </w:r>
+      <w:r>
+        <w:t xml:space="preserve">.</w:t>
+      </w:r>
+    </w:p>
+    <w:p>
+      <w:pPr>
+        <w:spacing w:after="60"/>
+        <w:ind w:left="480" w:hanging="360"/>
+      </w:pPr>
+      <w:r>
+        <w:rPr>
+          <w:b/>
+          <w:bCs/>
+          <w:color w:val="2563EB"/>
+        </w:rPr>
+        <w:t xml:space="preserve">2.	</w:t>
+      </w:r>
+      <w:r>
+        <w:t xml:space="preserve">Give it a </w:t>
+      </w:r>
+      <w:r>
+        <w:rPr>
+          <w:b/>
+          <w:bCs/>
+        </w:rPr>
+        <w:t xml:space="preserve">title</w:t>
+      </w:r>
+      <w:r>
+        <w:t xml:space="preserve">, pick the </w:t>
+      </w:r>
+      <w:r>
+        <w:rPr>
+          <w:b/>
+          <w:bCs/>
+        </w:rPr>
+        <w:t xml:space="preserve">solution profile</w:t>
+      </w:r>
+      <w:r>
+        <w:t xml:space="preserve">, and (optionally) add </w:t>
+      </w:r>
+      <w:r>
+        <w:rPr>
+          <w:b/>
+          <w:bCs/>
+        </w:rPr>
+        <w:t xml:space="preserve">objectives, success criteria and a planned value</w:t>
+      </w:r>
+      <w:r>
+        <w:t xml:space="preserve">. Click </w:t>
+      </w:r>
+      <w:r>
+        <w:rPr>
+          <w:b/>
+          <w:bCs/>
+        </w:rPr>
+        <w:t xml:space="preserve">Create track</w:t>
+      </w:r>
+      <w:r>
+        <w:t xml:space="preserve">.</w:t>
+      </w:r>
+    </w:p>
+    <w:p>
+      <w:pPr>
+        <w:spacing w:after="60"/>
+        <w:ind w:left="480" w:hanging="360"/>
+      </w:pPr>
+      <w:r>
+        <w:rPr>
+          <w:b/>
+          <w:bCs/>
+          <w:color w:val="2563EB"/>
+        </w:rPr>
+        <w:t xml:space="preserve">3.	</w:t>
+      </w:r>
+      <w:r>
+        <w:t xml:space="preserve">You land on a fresh track marked </w:t>
+      </w:r>
+      <w:r>
+        <w:rPr>
+          <w:b/>
+          <w:bCs/>
+        </w:rPr>
+        <w:t xml:space="preserve">"standalone (existing software)"</w:t>
+      </w:r>
+      <w:r>
+        <w:t xml:space="preserve"> — no source study, and </w:t>
+      </w:r>
+      <w:r>
+        <w:rPr>
+          <w:i/>
+          <w:iCs/>
+        </w:rPr>
+        <w:t xml:space="preserve">nothing pre-seeded</w:t>
+      </w:r>
+      <w:r>
+        <w:t xml:space="preserve">. It runs the </w:t>
+      </w:r>
+      <w:r>
+        <w:rPr>
+          <w:b/>
+          <w:bCs/>
+        </w:rPr>
+        <w:t xml:space="preserve">same 7-phase lifecycle</w:t>
+      </w:r>
+      <w:r>
+        <w:t xml:space="preserve">; you set the </w:t>
+      </w:r>
+      <w:r>
+        <w:rPr>
+          <w:b/>
+          <w:bCs/>
+        </w:rPr>
+        <w:t xml:space="preserve">baselines in Phase 2</w:t>
+      </w:r>
+      <w:r>
+        <w:t xml:space="preserve"> from the live deployment instead of inheriting them from a study.</w:t>
+      </w:r>
+    </w:p>
+    <w:p>
+      <w:pPr>
+        <w:pBdr>
+          <w:left w:val="single" w:color="2563EB" w:sz="18" w:space="8"/>
+        </w:pBdr>
+        <w:spacing w:after="120" w:before="40"/>
+        <w:ind w:left="360"/>
+      </w:pPr>
+      <w:r>
+        <w:rPr>
+          <w:i/>
+          <w:iCs/>
+          <w:color w:val="64748B"/>
+        </w:rPr>
+        <w:t xml:space="preserve">"Same proof, different starting point. When there's no case to engineer — the customer already owns it — you skip VE and the handover and go straight to realizing value. This is the motion for </w:t>
+      </w:r>
+      <w:r>
+        <w:rPr>
+          <w:b/>
+          <w:bCs/>
+          <w:i/>
+          <w:iCs/>
+          <w:color w:val="64748B"/>
+        </w:rPr>
+        <w:t xml:space="preserve">renewal assurance and adoption rescues on the installed base</w:t>
+      </w:r>
+      <w:r>
+        <w:rPr>
+          <w:i/>
+          <w:iCs/>
+          <w:color w:val="64748B"/>
+        </w:rPr>
+        <w:t xml:space="preserve">: run the lifecycle, set honest baselines from what's live today, and prove the value against them."</w:t>
+      </w:r>
+    </w:p>
+    <w:p>
+      <w:pPr>
+        <w:spacing w:after="120" w:line="264"/>
+      </w:pPr>
+      <w:r>
+        <w:t xml:space="preserve">Contrast it with the handover track from section 5: one was </w:t>
+      </w:r>
+      <w:r>
+        <w:rPr>
+          <w:i/>
+          <w:iCs/>
+        </w:rPr>
+        <w:t xml:space="preserve">born from a study</w:t>
+      </w:r>
+      <w:r>
+        <w:t xml:space="preserve">, the other </w:t>
+      </w:r>
+      <w:r>
+        <w:rPr>
+          <w:i/>
+          <w:iCs/>
+        </w:rPr>
+        <w:t xml:space="preserve">started standalone</w:t>
+      </w:r>
+      <w:r>
+        <w:t xml:space="preserve"> — and the workspace labels each so you always know which is which.</w:t>
+      </w:r>
+    </w:p>
+    <w:p>
+      <w:pPr>
+        <w:pBdr>
+          <w:bottom w:val="single" w:color="DBE3F0" w:sz="6" w:space="1"/>
+        </w:pBdr>
+        <w:spacing w:after="160" w:before="40"/>
+      </w:pPr>
+    </w:p>
+    <w:p>
+      <w:pPr>
+        <w:pStyle w:val="Heading1"/>
+        <w:spacing w:after="100" w:before="260"/>
+      </w:pPr>
+      <w:r>
+        <w:rPr>
+          <w:color w:val="2563EB"/>
+        </w:rPr>
         <w:t xml:space="preserve">7 · Multi-tenant &amp; roles (1–2 min · optional)</w:t>
       </w:r>
     </w:p>
@@ -2661,6 +2931,60 @@
             </w:r>
             <w:r>
               <w:t xml:space="preserve"> — the function analysis, the business case, and the realized-vs-planned reconciliation a PM tool doesn't model. It complements delivery tooling; it doesn't replace it."</w:t>
+            </w:r>
+          </w:p>
+        </w:tc>
+      </w:tr>
+      <w:tr>
+        <w:tc>
+          <w:tcPr>
+            <w:tcW w:type="dxa" w:w="4680"/>
+            <w:tcMar>
+              <w:top w:type="dxa" w:w="60"/>
+              <w:left w:type="dxa" w:w="110"/>
+              <w:bottom w:type="dxa" w:w="60"/>
+              <w:right w:type="dxa" w:w="110"/>
+            </w:tcMar>
+          </w:tcPr>
+          <w:p>
+            <w:r>
+              <w:t xml:space="preserve">"The customer already owns the software — there's no new deal to engineer."</w:t>
+            </w:r>
+          </w:p>
+        </w:tc>
+        <w:tc>
+          <w:tcPr>
+            <w:tcW w:type="dxa" w:w="4680"/>
+            <w:tcMar>
+              <w:top w:type="dxa" w:w="60"/>
+              <w:left w:type="dxa" w:w="110"/>
+              <w:bottom w:type="dxa" w:w="60"/>
+              <w:right w:type="dxa" w:w="110"/>
+            </w:tcMar>
+          </w:tcPr>
+          <w:p>
+            <w:r>
+              <w:t xml:space="preserve">"Then start a </w:t>
+            </w:r>
+            <w:r>
+              <w:rPr>
+                <w:b/>
+                <w:bCs/>
+              </w:rPr>
+              <w:t xml:space="preserve">standalone realization track</w:t>
+            </w:r>
+            <w:r>
+              <w:t xml:space="preserve">: skip VE and the handover, and run the same 7-phase lifecycle to protect and prove value on what they already run — ideal for </w:t>
+            </w:r>
+            <w:r>
+              <w:rPr>
+                <w:b/>
+                <w:bCs/>
+              </w:rPr>
+              <w:t xml:space="preserve">renewals and adoption rescues</w:t>
+            </w:r>
+            <w:r>
+              <w:t xml:space="preserve"> (section 6b)."</w:t>
             </w:r>
           </w:p>
         </w:tc>
@@ -3262,7 +3586,14 @@
           </w:tcPr>
           <w:p>
             <w:r>
-              <w:t xml:space="preserve">7 · Multi-tenant &amp; roles</w:t>
+              <w:t xml:space="preserve">6b · Standalone realization </w:t>
+            </w:r>
+            <w:r>
+              <w:rPr>
+                <w:i/>
+                <w:iCs/>
+              </w:rPr>
+              <w:t xml:space="preserve">(optional)</w:t>
             </w:r>
           </w:p>
         </w:tc>
@@ -3278,7 +3609,7 @@
           </w:tcPr>
           <w:p>
             <w:r>
-              <w:t xml:space="preserve">2</w:t>
+              <w:t xml:space="preserve">+1–2</w:t>
             </w:r>
           </w:p>
         </w:tc>
@@ -3294,7 +3625,7 @@
           </w:tcPr>
           <w:p>
             <w:r>
-              <w:t xml:space="preserve">21</w:t>
+              <w:t xml:space="preserve">—</w:t>
             </w:r>
           </w:p>
         </w:tc>
@@ -3312,6 +3643,56 @@
           </w:tcPr>
           <w:p>
             <w:r>
+              <w:t xml:space="preserve">7 · Multi-tenant &amp; roles</w:t>
+            </w:r>
+          </w:p>
+        </w:tc>
+        <w:tc>
+          <w:tcPr>
+            <w:tcW w:type="dxa" w:w="3120"/>
+            <w:tcMar>
+              <w:top w:type="dxa" w:w="60"/>
+              <w:left w:type="dxa" w:w="110"/>
+              <w:bottom w:type="dxa" w:w="60"/>
+              <w:right w:type="dxa" w:w="110"/>
+            </w:tcMar>
+          </w:tcPr>
+          <w:p>
+            <w:r>
+              <w:t xml:space="preserve">2</w:t>
+            </w:r>
+          </w:p>
+        </w:tc>
+        <w:tc>
+          <w:tcPr>
+            <w:tcW w:type="dxa" w:w="3120"/>
+            <w:tcMar>
+              <w:top w:type="dxa" w:w="60"/>
+              <w:left w:type="dxa" w:w="110"/>
+              <w:bottom w:type="dxa" w:w="60"/>
+              <w:right w:type="dxa" w:w="110"/>
+            </w:tcMar>
+          </w:tcPr>
+          <w:p>
+            <w:r>
+              <w:t xml:space="preserve">21</w:t>
+            </w:r>
+          </w:p>
+        </w:tc>
+      </w:tr>
+      <w:tr>
+        <w:tc>
+          <w:tcPr>
+            <w:tcW w:type="dxa" w:w="3120"/>
+            <w:tcMar>
+              <w:top w:type="dxa" w:w="60"/>
+              <w:left w:type="dxa" w:w="110"/>
+              <w:bottom w:type="dxa" w:w="60"/>
+              <w:right w:type="dxa" w:w="110"/>
+            </w:tcMar>
+          </w:tcPr>
+          <w:p>
+            <w:r>
               <w:t xml:space="preserve">8 · Close</w:t>
             </w:r>
           </w:p>
@@ -3360,7 +3741,7 @@
         <w:spacing w:after="120" w:line="264"/>
       </w:pPr>
       <w:r>
-        <w:t xml:space="preserve">Runs ~22 minutes with room for questions. To cut to </w:t>
+        <w:t xml:space="preserve">Runs ~22 minutes with room for questions; the standalone-realization aside (6b) is optional and additive. To cut to </w:t>
       </w:r>
       <w:r>
         <w:rPr>

</xml_diff>

<commit_message>
demo-kit: add a Customer Success beat to the demo script
New optional section 6c (walk the CS workspace, health scorecard,
generate an EBR, portfolio CS lens), a CRM/CS objection-handling row,
a timing-sheet entry, and the CSM demo login in the setup checklist.
Rebuild Demo-Script .docx/.pdf and regenerate the User-Guide .docx/.pdf
(now carrying the CS section from the reference-docs pass).

Co-Authored-By: Claude Opus 4.8 <noreply@anthropic.com>
</commit_message>
<xml_diff>
--- a/demo-kit/ValueLifecycle-Demo-Script.docx
+++ b/demo-kit/ValueLifecycle-Demo-Script.docx
@@ -429,6 +429,54 @@
           </w:tcPr>
           <w:p>
             <w:r>
+              <w:t xml:space="preserve">Customer Success login</w:t>
+            </w:r>
+          </w:p>
+        </w:tc>
+        <w:tc>
+          <w:tcPr>
+            <w:tcW w:type="dxa" w:w="4680"/>
+            <w:tcMar>
+              <w:top w:type="dxa" w:w="60"/>
+              <w:left w:type="dxa" w:w="110"/>
+              <w:bottom w:type="dxa" w:w="60"/>
+              <w:right w:type="dxa" w:w="110"/>
+            </w:tcMar>
+          </w:tcPr>
+          <w:p>
+            <w:r>
+              <w:rPr>
+                <w:rFonts w:ascii="Consolas" w:cs="Consolas" w:eastAsia="Consolas" w:hAnsi="Consolas"/>
+                <w:color w:val="B91C1C"/>
+              </w:rPr>
+              <w:t xml:space="preserve">cs@demo.app</w:t>
+            </w:r>
+            <w:r>
+              <w:t xml:space="preserve"> · </w:t>
+            </w:r>
+            <w:r>
+              <w:rPr>
+                <w:rFonts w:ascii="Consolas" w:cs="Consolas" w:eastAsia="Consolas" w:hAnsi="Consolas"/>
+                <w:color w:val="B91C1C"/>
+              </w:rPr>
+              <w:t xml:space="preserve">demo1234</w:t>
+            </w:r>
+          </w:p>
+        </w:tc>
+      </w:tr>
+      <w:tr>
+        <w:tc>
+          <w:tcPr>
+            <w:tcW w:type="dxa" w:w="4680"/>
+            <w:tcMar>
+              <w:top w:type="dxa" w:w="60"/>
+              <w:left w:type="dxa" w:w="110"/>
+              <w:bottom w:type="dxa" w:w="60"/>
+              <w:right w:type="dxa" w:w="110"/>
+            </w:tcMar>
+          </w:tcPr>
+          <w:p>
+            <w:r>
               <w:t xml:space="preserve">Admin login</w:t>
             </w:r>
           </w:p>
@@ -2523,6 +2571,311 @@
       </w:r>
       <w:r>
         <w:t xml:space="preserve"> — and the workspace labels each so you always know which is which.</w:t>
+      </w:r>
+    </w:p>
+    <w:p>
+      <w:pPr>
+        <w:pBdr>
+          <w:bottom w:val="single" w:color="DBE3F0" w:sz="6" w:space="1"/>
+        </w:pBdr>
+        <w:spacing w:after="160" w:before="40"/>
+      </w:pPr>
+    </w:p>
+    <w:p>
+      <w:pPr>
+        <w:pStyle w:val="Heading1"/>
+        <w:spacing w:after="100" w:before="260"/>
+      </w:pPr>
+      <w:r>
+        <w:rPr>
+          <w:color w:val="2563EB"/>
+        </w:rPr>
+        <w:t xml:space="preserve">6c · Customer Success — the continuing relationship </w:t>
+      </w:r>
+      <w:r>
+        <w:rPr>
+          <w:i/>
+          <w:iCs/>
+          <w:color w:val="2563EB"/>
+        </w:rPr>
+        <w:t xml:space="preserve">(2 min · optional)</w:t>
+      </w:r>
+    </w:p>
+    <w:p>
+      <w:pPr>
+        <w:spacing w:after="120" w:line="264"/>
+      </w:pPr>
+      <w:r>
+        <w:t xml:space="preserve">Realization proves </w:t>
+      </w:r>
+      <w:r>
+        <w:rPr>
+          <w:i/>
+          <w:iCs/>
+        </w:rPr>
+        <w:t xml:space="preserve">one</w:t>
+      </w:r>
+      <w:r>
+        <w:t xml:space="preserve"> initiative and closes out; </w:t>
+      </w:r>
+      <w:r>
+        <w:rPr>
+          <w:b/>
+          <w:bCs/>
+        </w:rPr>
+        <w:t xml:space="preserve">Customer Success</w:t>
+      </w:r>
+      <w:r>
+        <w:t xml:space="preserve"> keeps the whole account healthy through renewal and expansion. Switch to </w:t>
+      </w:r>
+      <w:r>
+        <w:rPr>
+          <w:b/>
+          <w:bCs/>
+        </w:rPr>
+        <w:t xml:space="preserve">Customer Success</w:t>
+      </w:r>
+      <w:r>
+        <w:t xml:space="preserve"> as </w:t>
+      </w:r>
+      <w:r>
+        <w:rPr>
+          <w:rFonts w:ascii="Consolas" w:cs="Consolas" w:eastAsia="Consolas" w:hAnsi="Consolas"/>
+          <w:color w:val="B91C1C"/>
+        </w:rPr>
+        <w:t xml:space="preserve">cs@demo.app</w:t>
+      </w:r>
+      <w:r>
+        <w:t xml:space="preserve">.</w:t>
+      </w:r>
+    </w:p>
+    <w:p>
+      <w:pPr>
+        <w:spacing w:after="60"/>
+        <w:ind w:left="480" w:hanging="360"/>
+      </w:pPr>
+      <w:r>
+        <w:rPr>
+          <w:b/>
+          <w:bCs/>
+          <w:color w:val="2563EB"/>
+        </w:rPr>
+        <w:t xml:space="preserve">1.	</w:t>
+      </w:r>
+      <w:r>
+        <w:t xml:space="preserve">On the </w:t>
+      </w:r>
+      <w:r>
+        <w:rPr>
+          <w:b/>
+          <w:bCs/>
+        </w:rPr>
+        <w:t xml:space="preserve">Customer Success workspace</w:t>
+      </w:r>
+      <w:r>
+        <w:t xml:space="preserve">, point at the two engagements and their </w:t>
+      </w:r>
+      <w:r>
+        <w:rPr>
+          <w:b/>
+          <w:bCs/>
+        </w:rPr>
+        <w:t xml:space="preserve">attention badges</w:t>
+      </w:r>
+      <w:r>
+        <w:t xml:space="preserve"> (health, renewal countdown, at-risk).</w:t>
+      </w:r>
+    </w:p>
+    <w:p>
+      <w:pPr>
+        <w:spacing w:after="60"/>
+        <w:ind w:left="480" w:hanging="360"/>
+      </w:pPr>
+      <w:r>
+        <w:rPr>
+          <w:b/>
+          <w:bCs/>
+          <w:color w:val="2563EB"/>
+        </w:rPr>
+        <w:t xml:space="preserve">2.	</w:t>
+      </w:r>
+      <w:r>
+        <w:t xml:space="preserve">Open </w:t>
+      </w:r>
+      <w:r>
+        <w:rPr>
+          <w:b/>
+          <w:bCs/>
+        </w:rPr>
+        <w:t xml:space="preserve">Retail Bank</w:t>
+      </w:r>
+      <w:r>
+        <w:t xml:space="preserve"> — walk the </w:t>
+      </w:r>
+      <w:r>
+        <w:rPr>
+          <w:b/>
+          <w:bCs/>
+        </w:rPr>
+        <w:t xml:space="preserve">8-stage lifecycle</w:t>
+      </w:r>
+      <w:r>
+        <w:t xml:space="preserve"> stepper, then the </w:t>
+      </w:r>
+      <w:r>
+        <w:rPr>
+          <w:b/>
+          <w:bCs/>
+        </w:rPr>
+        <w:t xml:space="preserve">value tiles surfaced from the linked VR track</w:t>
+      </w:r>
+      <w:r>
+        <w:t xml:space="preserve"> (the key line): </w:t>
+      </w:r>
+      <w:r>
+        <w:rPr>
+          <w:i/>
+          <w:iCs/>
+        </w:rPr>
+        <w:t xml:space="preserve">"the value lives on the track; Customer Success references it, it never re-enters it."</w:t>
+      </w:r>
+    </w:p>
+    <w:p>
+      <w:pPr>
+        <w:spacing w:after="60"/>
+        <w:ind w:left="480" w:hanging="360"/>
+      </w:pPr>
+      <w:r>
+        <w:rPr>
+          <w:b/>
+          <w:bCs/>
+          <w:color w:val="2563EB"/>
+        </w:rPr>
+        <w:t xml:space="preserve">3.	</w:t>
+      </w:r>
+      <w:r>
+        <w:t xml:space="preserve">Show the </w:t>
+      </w:r>
+      <w:r>
+        <w:rPr>
+          <w:b/>
+          <w:bCs/>
+        </w:rPr>
+        <w:t xml:space="preserve">Health Scorecard</w:t>
+      </w:r>
+      <w:r>
+        <w:t xml:space="preserve"> (five weighted factors → a RAG band), the </w:t>
+      </w:r>
+      <w:r>
+        <w:rPr>
+          <w:b/>
+          <w:bCs/>
+        </w:rPr>
+        <w:t xml:space="preserve">Stakeholder Map</w:t>
+      </w:r>
+      <w:r>
+        <w:t xml:space="preserve">, and the </w:t>
+      </w:r>
+      <w:r>
+        <w:rPr>
+          <w:b/>
+          <w:bCs/>
+        </w:rPr>
+        <w:t xml:space="preserve">Action Log</w:t>
+      </w:r>
+      <w:r>
+        <w:t xml:space="preserve">.</w:t>
+      </w:r>
+    </w:p>
+    <w:p>
+      <w:pPr>
+        <w:spacing w:after="60"/>
+        <w:ind w:left="480" w:hanging="360"/>
+      </w:pPr>
+      <w:r>
+        <w:rPr>
+          <w:b/>
+          <w:bCs/>
+          <w:color w:val="2563EB"/>
+        </w:rPr>
+        <w:t xml:space="preserve">4.	</w:t>
+      </w:r>
+      <w:r>
+        <w:t xml:space="preserve">Click </w:t>
+      </w:r>
+      <w:r>
+        <w:rPr>
+          <w:b/>
+          <w:bCs/>
+        </w:rPr>
+        <w:t xml:space="preserve">Generate EBR</w:t>
+      </w:r>
+      <w:r>
+        <w:t xml:space="preserve"> — an executive narrative (AI, or a template fallback) is drafted from the account's data, and its next-best-actions drop straight into the Action Log. Then </w:t>
+      </w:r>
+      <w:r>
+        <w:rPr>
+          <w:b/>
+          <w:bCs/>
+        </w:rPr>
+        <w:t xml:space="preserve">Export account review</w:t>
+      </w:r>
+      <w:r>
+        <w:t xml:space="preserve">.</w:t>
+      </w:r>
+    </w:p>
+    <w:p>
+      <w:pPr>
+        <w:spacing w:after="60"/>
+        <w:ind w:left="480" w:hanging="360"/>
+      </w:pPr>
+      <w:r>
+        <w:rPr>
+          <w:b/>
+          <w:bCs/>
+          <w:color w:val="2563EB"/>
+        </w:rPr>
+        <w:t xml:space="preserve">5.	</w:t>
+      </w:r>
+      <w:r>
+        <w:t xml:space="preserve">Back on the </w:t>
+      </w:r>
+      <w:r>
+        <w:rPr>
+          <w:b/>
+          <w:bCs/>
+        </w:rPr>
+        <w:t xml:space="preserve">Portfolio</w:t>
+      </w:r>
+      <w:r>
+        <w:t xml:space="preserve">, point at the </w:t>
+      </w:r>
+      <w:r>
+        <w:rPr>
+          <w:b/>
+          <w:bCs/>
+        </w:rPr>
+        <w:t xml:space="preserve">Customer Success lens</w:t>
+      </w:r>
+      <w:r>
+        <w:t xml:space="preserve"> — health distribution, upcoming renewals, and the needs-attention list.</w:t>
+      </w:r>
+    </w:p>
+    <w:p>
+      <w:pPr>
+        <w:pBdr>
+          <w:left w:val="single" w:color="2563EB" w:sz="18" w:space="8"/>
+        </w:pBdr>
+        <w:spacing w:after="120" w:before="40"/>
+        <w:ind w:left="360"/>
+      </w:pPr>
+      <w:r>
+        <w:rPr>
+          <w:i/>
+          <w:iCs/>
+          <w:color w:val="64748B"/>
+        </w:rPr>
+        <w:t xml:space="preserve">"Sell it, prove it, keep it. The handover turns approved value into proven value; Customer Success turns proven value into a renewed, growing relationship — one workspace, each layer referencing the one beneath it."</w:t>
       </w:r>
     </w:p>
     <w:p>
@@ -2985,6 +3338,50 @@
             </w:r>
             <w:r>
               <w:t xml:space="preserve"> (section 6b)."</w:t>
+            </w:r>
+          </w:p>
+        </w:tc>
+      </w:tr>
+      <w:tr>
+        <w:tc>
+          <w:tcPr>
+            <w:tcW w:type="dxa" w:w="4680"/>
+            <w:tcMar>
+              <w:top w:type="dxa" w:w="60"/>
+              <w:left w:type="dxa" w:w="110"/>
+              <w:bottom w:type="dxa" w:w="60"/>
+              <w:right w:type="dxa" w:w="110"/>
+            </w:tcMar>
+          </w:tcPr>
+          <w:p>
+            <w:r>
+              <w:t xml:space="preserve">"How is this different from our CRM / Customer Success tool?"</w:t>
+            </w:r>
+          </w:p>
+        </w:tc>
+        <w:tc>
+          <w:tcPr>
+            <w:tcW w:type="dxa" w:w="4680"/>
+            <w:tcMar>
+              <w:top w:type="dxa" w:w="60"/>
+              <w:left w:type="dxa" w:w="110"/>
+              <w:bottom w:type="dxa" w:w="60"/>
+              <w:right w:type="dxa" w:w="110"/>
+            </w:tcMar>
+          </w:tcPr>
+          <w:p>
+            <w:r>
+              <w:t xml:space="preserve">"It doesn't replace the CRM — it's the value spine underneath it. The Customer Success engagement here </w:t>
+            </w:r>
+            <w:r>
+              <w:rPr>
+                <w:b/>
+                <w:bCs/>
+              </w:rPr>
+              <w:t xml:space="preserve">references the actual VE studies and VR tracks</w:t>
+            </w:r>
+            <w:r>
+              <w:t xml:space="preserve">, so health, renewal and expansion conversations are grounded in proven value, not just activity metrics (section 6c)."</w:t>
             </w:r>
           </w:p>
         </w:tc>
@@ -3610,6 +4007,63 @@
           <w:p>
             <w:r>
               <w:t xml:space="preserve">+1–2</w:t>
+            </w:r>
+          </w:p>
+        </w:tc>
+        <w:tc>
+          <w:tcPr>
+            <w:tcW w:type="dxa" w:w="3120"/>
+            <w:tcMar>
+              <w:top w:type="dxa" w:w="60"/>
+              <w:left w:type="dxa" w:w="110"/>
+              <w:bottom w:type="dxa" w:w="60"/>
+              <w:right w:type="dxa" w:w="110"/>
+            </w:tcMar>
+          </w:tcPr>
+          <w:p>
+            <w:r>
+              <w:t xml:space="preserve">—</w:t>
+            </w:r>
+          </w:p>
+        </w:tc>
+      </w:tr>
+      <w:tr>
+        <w:tc>
+          <w:tcPr>
+            <w:tcW w:type="dxa" w:w="3120"/>
+            <w:tcMar>
+              <w:top w:type="dxa" w:w="60"/>
+              <w:left w:type="dxa" w:w="110"/>
+              <w:bottom w:type="dxa" w:w="60"/>
+              <w:right w:type="dxa" w:w="110"/>
+            </w:tcMar>
+          </w:tcPr>
+          <w:p>
+            <w:r>
+              <w:t xml:space="preserve">6c · Customer Success </w:t>
+            </w:r>
+            <w:r>
+              <w:rPr>
+                <w:i/>
+                <w:iCs/>
+              </w:rPr>
+              <w:t xml:space="preserve">(optional)</w:t>
+            </w:r>
+          </w:p>
+        </w:tc>
+        <w:tc>
+          <w:tcPr>
+            <w:tcW w:type="dxa" w:w="3120"/>
+            <w:tcMar>
+              <w:top w:type="dxa" w:w="60"/>
+              <w:left w:type="dxa" w:w="110"/>
+              <w:bottom w:type="dxa" w:w="60"/>
+              <w:right w:type="dxa" w:w="110"/>
+            </w:tcMar>
+          </w:tcPr>
+          <w:p>
+            <w:r>
+              <w:t xml:space="preserve">+2</w:t>
             </w:r>
           </w:p>
         </w:tc>

</xml_diff>

<commit_message>
demo-kit: regenerate Demo-Script & User-Guide docx/pdf without the demo password
The generated .docx/.pdf were built from the pre-scrub markdown and still
carried `demo1234`. Rebuild both .docx (via md2docx.js) and both .pdf from the
scrubbed markdown so no binary deliverable publishes the password. Add
md2pdf.js — the previously-undocumented headless-Chrome md→PDF regenerator.

Co-Authored-By: Claude Opus 4.8 <noreply@anthropic.com>
</commit_message>
<xml_diff>
--- a/demo-kit/ValueLifecycle-Demo-Script.docx
+++ b/demo-kit/ValueLifecycle-Demo-Script.docx
@@ -107,7 +107,7 @@
           <w:iCs/>
           <w:color w:val="64748B"/>
         </w:rPr>
-        <w:t xml:space="preserve">; every demo account's password is </w:t>
+        <w:t xml:space="preserve">; every demo account uses the shared seeded password (set in </w:t>
       </w:r>
       <w:r>
         <w:rPr>
@@ -116,15 +116,15 @@
           <w:iCs/>
           <w:color w:val="64748B"/>
         </w:rPr>
-        <w:t xml:space="preserve">demo1234</w:t>
-      </w:r>
-      <w:r>
-        <w:rPr>
-          <w:i/>
-          <w:iCs/>
-          <w:color w:val="64748B"/>
-        </w:rPr>
-        <w:t xml:space="preserve">. Keep this script on a second screen. Timings are a guide, not a metronome.</w:t>
+        <w:t xml:space="preserve">prisma/seed.ts</w:t>
+      </w:r>
+      <w:r>
+        <w:rPr>
+          <w:i/>
+          <w:iCs/>
+          <w:color w:val="64748B"/>
+        </w:rPr>
+        <w:t xml:space="preserve">). Keep this script on a second screen. Timings are a guide, not a metronome.</w:t>
       </w:r>
     </w:p>
     <w:p>
@@ -307,16 +307,6 @@
               </w:rPr>
               <w:t xml:space="preserve">ve@demo.app</w:t>
             </w:r>
-            <w:r>
-              <w:t xml:space="preserve"> · </w:t>
-            </w:r>
-            <w:r>
-              <w:rPr>
-                <w:rFonts w:ascii="Consolas" w:cs="Consolas" w:eastAsia="Consolas" w:hAnsi="Consolas"/>
-                <w:color w:val="B91C1C"/>
-              </w:rPr>
-              <w:t xml:space="preserve">demo1234</w:t>
-            </w:r>
           </w:p>
         </w:tc>
       </w:tr>
@@ -355,16 +345,6 @@
               </w:rPr>
               <w:t xml:space="preserve">reviewer@demo.app</w:t>
             </w:r>
-            <w:r>
-              <w:t xml:space="preserve"> · </w:t>
-            </w:r>
-            <w:r>
-              <w:rPr>
-                <w:rFonts w:ascii="Consolas" w:cs="Consolas" w:eastAsia="Consolas" w:hAnsi="Consolas"/>
-                <w:color w:val="B91C1C"/>
-              </w:rPr>
-              <w:t xml:space="preserve">demo1234</w:t>
-            </w:r>
           </w:p>
         </w:tc>
       </w:tr>
@@ -403,16 +383,6 @@
               </w:rPr>
               <w:t xml:space="preserve">vrm@demo.app</w:t>
             </w:r>
-            <w:r>
-              <w:t xml:space="preserve"> · </w:t>
-            </w:r>
-            <w:r>
-              <w:rPr>
-                <w:rFonts w:ascii="Consolas" w:cs="Consolas" w:eastAsia="Consolas" w:hAnsi="Consolas"/>
-                <w:color w:val="B91C1C"/>
-              </w:rPr>
-              <w:t xml:space="preserve">demo1234</w:t>
-            </w:r>
           </w:p>
         </w:tc>
       </w:tr>
@@ -451,16 +421,6 @@
               </w:rPr>
               <w:t xml:space="preserve">cs@demo.app</w:t>
             </w:r>
-            <w:r>
-              <w:t xml:space="preserve"> · </w:t>
-            </w:r>
-            <w:r>
-              <w:rPr>
-                <w:rFonts w:ascii="Consolas" w:cs="Consolas" w:eastAsia="Consolas" w:hAnsi="Consolas"/>
-                <w:color w:val="B91C1C"/>
-              </w:rPr>
-              <w:t xml:space="preserve">demo1234</w:t>
-            </w:r>
           </w:p>
         </w:tc>
       </w:tr>
@@ -498,16 +458,6 @@
                 <w:color w:val="B91C1C"/>
               </w:rPr>
               <w:t xml:space="preserve">admin@demo.app</w:t>
-            </w:r>
-            <w:r>
-              <w:t xml:space="preserve"> · </w:t>
-            </w:r>
-            <w:r>
-              <w:rPr>
-                <w:rFonts w:ascii="Consolas" w:cs="Consolas" w:eastAsia="Consolas" w:hAnsi="Consolas"/>
-                <w:color w:val="B91C1C"/>
-              </w:rPr>
-              <w:t xml:space="preserve">demo1234</w:t>
             </w:r>
           </w:p>
         </w:tc>

</xml_diff>

<commit_message>
Auth: drive the demo password from DEMO_PASSWORD env var (no hard-coded literal)
Remove the last `demo1234` literals from the source. The seed now reads the
shared demo password from DEMO_PASSWORD, and when it's unset generates a random
one and prints it (so nothing is baked into the public repo). The login page
reads the same variable and passes it to the client only when the member picker
is on (never in production); one-click demo sign-in appears only when a
DEMO_PASSWORD is set, otherwise the demo workspace falls back to email-prefill +
typed password. Document DEMO_PASSWORD in .env.example and DEPLOYMENT, update the
user guide / demo script wording, and regenerate the affected demo-kit docx/pdf.

Co-Authored-By: Claude Opus 4.8 <noreply@anthropic.com>
</commit_message>
<xml_diff>
--- a/demo-kit/ValueLifecycle-Demo-Script.docx
+++ b/demo-kit/ValueLifecycle-Demo-Script.docx
@@ -107,7 +107,7 @@
           <w:iCs/>
           <w:color w:val="64748B"/>
         </w:rPr>
-        <w:t xml:space="preserve">; every demo account uses the shared seeded password (set in </w:t>
+        <w:t xml:space="preserve">; every demo account uses the shared password from the </w:t>
       </w:r>
       <w:r>
         <w:rPr>
@@ -116,15 +116,32 @@
           <w:iCs/>
           <w:color w:val="64748B"/>
         </w:rPr>
-        <w:t xml:space="preserve">prisma/seed.ts</w:t>
-      </w:r>
-      <w:r>
-        <w:rPr>
-          <w:i/>
-          <w:iCs/>
-          <w:color w:val="64748B"/>
-        </w:rPr>
-        <w:t xml:space="preserve">). Keep this script on a second screen. Timings are a guide, not a metronome.</w:t>
+        <w:t xml:space="preserve">DEMO_PASSWORD</w:t>
+      </w:r>
+      <w:r>
+        <w:rPr>
+          <w:i/>
+          <w:iCs/>
+          <w:color w:val="64748B"/>
+        </w:rPr>
+        <w:t xml:space="preserve"> env var (set it in </w:t>
+      </w:r>
+      <w:r>
+        <w:rPr>
+          <w:rFonts w:ascii="Consolas" w:cs="Consolas" w:eastAsia="Consolas" w:hAnsi="Consolas"/>
+          <w:i/>
+          <w:iCs/>
+          <w:color w:val="64748B"/>
+        </w:rPr>
+        <w:t xml:space="preserve">.env</w:t>
+      </w:r>
+      <w:r>
+        <w:rPr>
+          <w:i/>
+          <w:iCs/>
+          <w:color w:val="64748B"/>
+        </w:rPr>
+        <w:t xml:space="preserve"> before seeding to enable one-click sign-in). Keep this script on a second screen. Timings are a guide, not a metronome.</w:t>
       </w:r>
     </w:p>
     <w:p>

</xml_diff>

<commit_message>
demo-kit(demo script): add optional ITSM-displacement sample storyline
§0 setup: note the filled sample VE+VR pair as an optional competitive
displacement / TCO storyline (import via Runbook §6a) — study at ROI ~385%
/ payback ~12mo and a track proving $630K/yr. Regenerated .docx + .pdf.

Co-Authored-By: Claude Opus 4.8 <noreply@anthropic.com>
</commit_message>
<xml_diff>
--- a/demo-kit/ValueLifecycle-Demo-Script.docx
+++ b/demo-kit/ValueLifecycle-Demo-Script.docx
@@ -587,6 +587,81 @@
       </w:r>
       <w:r>
         <w:t xml:space="preserve"> already loaded in a background tab so you can jump to a "finished" example if you run short on time.</w:t>
+      </w:r>
+    </w:p>
+    <w:p>
+      <w:pPr>
+        <w:spacing w:after="120" w:line="264"/>
+      </w:pPr>
+      <w:r>
+        <w:rPr>
+          <w:b/>
+          <w:bCs/>
+        </w:rPr>
+        <w:t xml:space="preserve">Optional storyline — ITSM-platform displacement.</w:t>
+      </w:r>
+      <w:r>
+        <w:t xml:space="preserve"> The kit ships a filled sample </w:t>
+      </w:r>
+      <w:r>
+        <w:rPr>
+          <w:b/>
+          <w:bCs/>
+        </w:rPr>
+        <w:t xml:space="preserve">VE + VR pair</w:t>
+      </w:r>
+      <w:r>
+        <w:t xml:space="preserve"> (</w:t>
+      </w:r>
+      <w:r>
+        <w:rPr>
+          <w:rFonts w:ascii="Consolas" w:cs="Consolas" w:eastAsia="Consolas" w:hAnsi="Consolas"/>
+          <w:color w:val="B91C1C"/>
+        </w:rPr>
+        <w:t xml:space="preserve">ValueLifecycle-Sample-ITSM-Displacement-VE-Discovery.xlsx</w:t>
+      </w:r>
+      <w:r>
+        <w:t xml:space="preserve"> / </w:t>
+      </w:r>
+      <w:r>
+        <w:rPr>
+          <w:rFonts w:ascii="Consolas" w:cs="Consolas" w:eastAsia="Consolas" w:hAnsi="Consolas"/>
+          <w:color w:val="B91C1C"/>
+        </w:rPr>
+        <w:t xml:space="preserve">-VR-Intake.xlsx</w:t>
+      </w:r>
+      <w:r>
+        <w:t xml:space="preserve">) for a competitive </w:t>
+      </w:r>
+      <w:r>
+        <w:rPr>
+          <w:b/>
+          <w:bCs/>
+        </w:rPr>
+        <w:t xml:space="preserve">displacement / TCO case</w:t>
+      </w:r>
+      <w:r>
+        <w:t xml:space="preserve">. Import them beforehand (Runbook §6a) if you want to run that storyline — a study landing </w:t>
+      </w:r>
+      <w:r>
+        <w:rPr>
+          <w:b/>
+          <w:bCs/>
+        </w:rPr>
+        <w:t xml:space="preserve">ROI ~385% · payback ~12 months</w:t>
+      </w:r>
+      <w:r>
+        <w:t xml:space="preserve"> and a realization track proving </w:t>
+      </w:r>
+      <w:r>
+        <w:rPr>
+          <w:b/>
+          <w:bCs/>
+        </w:rPr>
+        <w:t xml:space="preserve">$630K/yr</w:t>
+      </w:r>
+      <w:r>
+        <w:t xml:space="preserve"> (linked back to its source study) — instead of, or alongside, the seeded hero study. It makes the "quantify, then prove" arc land hard for a cost-out audience.</w:t>
       </w:r>
     </w:p>
     <w:p>

</xml_diff>

<commit_message>
demo-kit(demo script): reconcile hero-study references with the seed
The seed builds VE-2026-014 (batch automation, handed over -> VR-2026-014)
and VE-2026-021 (IT service management); the script's codes were right but
the theme labels were stale (construction / SaaS / three industries).
Updated the setup table, the portfolio talk-track and the study-walk line
to match, keeping wording vendor-neutral. Regenerated .docx + .pdf.

Co-Authored-By: Claude Opus 4.8 <noreply@anthropic.com>
</commit_message>
<xml_diff>
--- a/demo-kit/ValueLifecycle-Demo-Script.docx
+++ b/demo-kit/ValueLifecycle-Demo-Script.docx
@@ -492,7 +492,7 @@
           </w:tcPr>
           <w:p>
             <w:r>
-              <w:t xml:space="preserve">Hero study (construction, handed over)</w:t>
+              <w:t xml:space="preserve">Hero study (batch automation, handed over)</w:t>
             </w:r>
           </w:p>
         </w:tc>
@@ -540,7 +540,7 @@
           </w:tcPr>
           <w:p>
             <w:r>
-              <w:t xml:space="preserve">Ready-to-hand-over study (SaaS)</w:t>
+              <w:t xml:space="preserve">Second study (IT service management)</w:t>
             </w:r>
           </w:p>
         </w:tc>
@@ -1023,7 +1023,7 @@
           <w:iCs/>
           <w:color w:val="64748B"/>
         </w:rPr>
-        <w:t xml:space="preserve">"Same platform, three industries out of the box — construction, manufacturing, SaaS — because industry here is </w:t>
+        <w:t xml:space="preserve">"Same platform, several solution profiles out of the box — workload automation, mainframe, service &amp; operations — because the profile here is </w:t>
       </w:r>
       <w:r>
         <w:rPr>
@@ -1077,7 +1077,7 @@
         <w:t xml:space="preserve">`VE-2026-021`</w:t>
       </w:r>
       <w:r>
-        <w:t xml:space="preserve"> (the SaaS study) from the VE workspace, or create a fresh one to show the wizard — your call on time.</w:t>
+        <w:t xml:space="preserve"> (the IT service management study) from the VE workspace, or create a fresh one to show the wizard — your call on time.</w:t>
       </w:r>
     </w:p>
     <w:p>

</xml_diff>